<commit_message>
feat(arkusz-mapa): loading date picker and transport order number for Word export
</commit_message>
<xml_diff>
--- a/docs/pusty.docx
+++ b/docs/pusty.docx
@@ -16,6 +16,13 @@
           <w:bCs/>
         </w:rPr>
         <w:t xml:space="preserve">Zlecenie transportowe nr: </w:t>
+      </w:r>
+      <w:r>
+        <w:rPr>
+          <w:b w:val="false"/>
+          <w:bCs w:val="false"/>
+        </w:rPr>
+        <w:t>{{numer_zlecenia_transportowego}}</w:t>
       </w:r>
     </w:p>
     <w:p>

</xml_diff>